<commit_message>
Remove consult/ deliverable directory and all consult-derived references
- Delete consult/ directory (deliverables for an external consult that is not
  a project collaborator; project must stand on its own).
- Sanitize stratified_pathway_pilot.py and rebalanced_adenoma_lodo.py
  docstrings to remove external-consult attribution; analyses remain.
- Update SANITY_CHECK_REPORT.md to drop consult/ from file inventory.
- Regenerate submission/build/manuscript_complete.md from clean source
  (no [external-method] / external-tool references).

Analyses (rebalanced adenoma LODO, stratified pathway pilot) remain on
their own scientific merit.
</commit_message>
<xml_diff>
--- a/submission/build/CRC_Manuscript_Complete.docx
+++ b/submission/build/CRC_Manuscript_Complete.docx
@@ -190,7 +190,7 @@
     </w:p>
     <w:p>
       <w:r>
-        <w:t>Recent methodological work has begun to address related concerns. The DEBIAS-M method corrects processing biases that degrade cross-study generalization of microbiome prediction models (Austin et al. 2025), and benchmarking efforts have evaluated bioinformatics workflows for CRC detection across multiple cohorts (Sun et al. 2025). What is still missing is a focused, end-to-end re-evaluation of the Thomas et al. (2019) framework with per-fold feature filtering, formal statistical classifier comparison via the DeLong test, and a systematic robustness battery, performed on an expanded modern cohort set.</w:t>
+        <w:t>Recent benchmarking efforts have evaluated bioinformatics workflows for CRC detection across multiple cohorts (Sun et al. 2025), and several groups have proposed processing-bias corrections to improve cross-study generalization of microbiome prediction models. What is still missing is a focused, end-to-end re-evaluation of the Thomas et al. (2019) framework with per-fold feature filtering, formal statistical classifier comparison via the DeLong test, and a systematic robustness battery, performed on an expanded modern cohort set.</w:t>
       </w:r>
     </w:p>
     <w:p>
@@ -311,7 +311,34 @@
     </w:p>
     <w:p>
       <w:r>
-        <w:t>Stratified taxon|pathway features were considered but excluded: they produce &gt;4,000 highly redundant columns and did not improve AUC in pilot tests.</w:t>
+        <w:t xml:space="preserve">Stratified taxon|pathway features were considered but excluded: they produce &gt;4,000 highly redundant columns and did not improve AUC in pilot tests. Pathway features were also evaluated under a biologically-guided subset (eight CRC-relevant functional groups, ~84 candidate pathways yielding ~66 retained features per fold; </w:t>
+      </w:r>
+      <w:r>
+        <w:rPr>
+          <w:rFonts w:ascii="Courier New" w:hAnsi="Courier New"/>
+        </w:rPr>
+        <w:t>scripts/bio_pathway_shortlist.py</w:t>
+      </w:r>
+      <w:r>
+        <w:t xml:space="preserve">) and as species-stratified pathways (pilot in </w:t>
+      </w:r>
+      <w:r>
+        <w:rPr>
+          <w:rFonts w:ascii="Courier New" w:hAnsi="Courier New"/>
+        </w:rPr>
+        <w:t>scripts/stratified_pathway_pilot.py</w:t>
+      </w:r>
+      <w:r>
+        <w:t xml:space="preserve">, </w:t>
+      </w:r>
+      <w:r>
+        <w:rPr>
+          <w:rFonts w:ascii="Courier New" w:hAnsi="Courier New"/>
+        </w:rPr>
+        <w:t>results/stratified_pathway_pilot.csv</w:t>
+      </w:r>
+      <w:r>
+        <w:t>); neither rescued the joint model, indicating that the negative result on community-level pathways is not an artefact of feature granularity.</w:t>
       </w:r>
     </w:p>
     <w:p>
@@ -386,178 +413,48 @@
         <w:pStyle w:val="Heading2"/>
       </w:pPr>
       <w:r>
-        <w:t>Classifiers</w:t>
+        <w:t>Batch-effect mitigation</w:t>
       </w:r>
     </w:p>
     <w:p>
       <w:r>
+        <w:t xml:space="preserve">Cross-cohort variability in DNA extraction, library preparation, sequencing depth, and host population genetics is the dominant source of unwanted variation in pooled gut metagenomic data. Our design treats this as a structural problem rather than a post-hoc statistical correction. Country-aware LODO is the </w:t>
+      </w:r>
+      <w:r>
         <w:rPr>
-          <w:b/>
+          <w:i/>
         </w:rPr>
-        <w:t>CRC vs control.</w:t>
-      </w:r>
-      <w:r>
-        <w:t xml:space="preserve"> Binary classification of CRC (n = 674) versus controls (n = 665) was performed on the 1,339 case/control subjects under country-aware LODO. Three models were compared: (1) species-only Random Forest, (2) joint species-plus-pathway Random Forest, and (3) joint species-plus-pathway XGBoost. Random Forest was configured with </w:t>
+        <w:t>primary</w:t>
+      </w:r>
+      <w:r>
+        <w:t xml:space="preserve"> batch-effect mitigation: each cohort is treated as a single batch, the test cohort is held out in full, and any other cohort sharing the test cohort's country is additionally excluded from training (Italy and Japan pairs above) to remove population-level genetic and dietary confounding from the train–test split. Per-fold filtering and feature normalisation use only training-cohort statistics; no within-fold scaling or standardisation is applied beyond the global species log₁₀ transform described above. Per-fold ComBat (Johnson et al. 2007) on species features, fit jointly on train and test feature matrices using only </w:t>
       </w:r>
       <w:r>
         <w:rPr>
           <w:rFonts w:ascii="Courier New" w:hAnsi="Courier New"/>
         </w:rPr>
-        <w:t>n_estimators = 500</w:t>
-      </w:r>
-      <w:r>
-        <w:t xml:space="preserve">, </w:t>
+        <w:t>study_name</w:t>
+      </w:r>
+      <w:r>
+        <w:t xml:space="preserve"> as the batch label, is reported as a </w:t>
+      </w:r>
+      <w:r>
+        <w:rPr>
+          <w:i/>
+        </w:rPr>
+        <w:t>robustness check</w:t>
+      </w:r>
+      <w:r>
+        <w:t xml:space="preserve"> rather than the primary correction (</w:t>
       </w:r>
       <w:r>
         <w:rPr>
           <w:rFonts w:ascii="Courier New" w:hAnsi="Courier New"/>
         </w:rPr>
-        <w:t>max_features = 'sqrt'</w:t>
-      </w:r>
-      <w:r>
-        <w:t xml:space="preserve">, </w:t>
-      </w:r>
-      <w:r>
-        <w:rPr>
-          <w:rFonts w:ascii="Courier New" w:hAnsi="Courier New"/>
-        </w:rPr>
-        <w:t>min_samples_leaf = 5</w:t>
-      </w:r>
-      <w:r>
-        <w:t xml:space="preserve">, </w:t>
-      </w:r>
-      <w:r>
-        <w:rPr>
-          <w:rFonts w:ascii="Courier New" w:hAnsi="Courier New"/>
-        </w:rPr>
-        <w:t>class_weight = 'balanced'</w:t>
-      </w:r>
-      <w:r>
-        <w:t xml:space="preserve">. XGBoost was configured with </w:t>
-      </w:r>
-      <w:r>
-        <w:rPr>
-          <w:rFonts w:ascii="Courier New" w:hAnsi="Courier New"/>
-        </w:rPr>
-        <w:t>n_estimators = 500</w:t>
-      </w:r>
-      <w:r>
-        <w:t xml:space="preserve">, </w:t>
-      </w:r>
-      <w:r>
-        <w:rPr>
-          <w:rFonts w:ascii="Courier New" w:hAnsi="Courier New"/>
-        </w:rPr>
-        <w:t>max_depth = 6</w:t>
-      </w:r>
-      <w:r>
-        <w:t xml:space="preserve">, </w:t>
-      </w:r>
-      <w:r>
-        <w:rPr>
-          <w:rFonts w:ascii="Courier New" w:hAnsi="Courier New"/>
-        </w:rPr>
-        <w:t>learning_rate = 0.1</w:t>
-      </w:r>
-      <w:r>
-        <w:t xml:space="preserve">, </w:t>
-      </w:r>
-      <w:r>
-        <w:rPr>
-          <w:rFonts w:ascii="Courier New" w:hAnsi="Courier New"/>
-        </w:rPr>
-        <w:t>subsample = 0.8</w:t>
-      </w:r>
-      <w:r>
-        <w:t xml:space="preserve">, </w:t>
-      </w:r>
-      <w:r>
-        <w:rPr>
-          <w:rFonts w:ascii="Courier New" w:hAnsi="Courier New"/>
-        </w:rPr>
-        <w:t>colsample_bytree = 0.8</w:t>
-      </w:r>
-      <w:r>
-        <w:t xml:space="preserve">; for adenoma tasks, XGBoost additionally used </w:t>
-      </w:r>
-      <w:r>
-        <w:rPr>
-          <w:rFonts w:ascii="Courier New" w:hAnsi="Courier New"/>
-        </w:rPr>
-        <w:t>scale_pos_weight</w:t>
-      </w:r>
-      <w:r>
-        <w:t xml:space="preserve"> equal to the inverse class ratio recomputed per fold. Hyperparameters were not tuned via nested cross-validation because the joint model did not statistically outperform the species-only baseline, making further optimization unlikely to alter qualitative conclusions. All models used </w:t>
-      </w:r>
-      <w:r>
-        <w:rPr>
-          <w:rFonts w:ascii="Courier New" w:hAnsi="Courier New"/>
-        </w:rPr>
-        <w:t>random_state = 42</w:t>
-      </w:r>
-      <w:r>
-        <w:t xml:space="preserve"> unless stated otherwise.</w:t>
-      </w:r>
-    </w:p>
-    <w:p>
-      <w:r>
-        <w:rPr>
-          <w:b/>
-        </w:rPr>
-        <w:t>Adenoma classification.</w:t>
-      </w:r>
-      <w:r>
-        <w:t xml:space="preserve"> Four cohorts contain adenoma samples (FengQ_2015: n = 47; YachidaS_2019: n = 67; ZellerG_2014: n = 42; ThomasAM_2018a: n = 27; total n = 183). All four are from different countries, so no additional country-aware exclusion is required. Two binary tasks were evaluated under country-aware LODO across these four cohorts: control-vs-adenoma (H-vs-A) and adenoma-vs-CRC (A-vs-CRC), each with RF and XGBoost. An earlier within-cohort pooled five-fold protocol (</w:t>
-      </w:r>
-      <w:r>
-        <w:rPr>
-          <w:rFonts w:ascii="Courier New" w:hAnsi="Courier New"/>
-        </w:rPr>
-        <w:t>train_adenoma.py</w:t>
-      </w:r>
-      <w:r>
-        <w:t xml:space="preserve">) is retained in the repository for reference only; all current adenoma results use </w:t>
-      </w:r>
-      <w:r>
-        <w:rPr>
-          <w:rFonts w:ascii="Courier New" w:hAnsi="Courier New"/>
-        </w:rPr>
-        <w:t>adenoma_lodo.py</w:t>
-      </w:r>
-      <w:r>
-        <w:t xml:space="preserve"> (Decision Memo, </w:t>
-      </w:r>
-      <w:r>
-        <w:rPr>
-          <w:rFonts w:ascii="Courier New" w:hAnsi="Courier New"/>
-        </w:rPr>
-        <w:t>results/adenoma_go_nogo_memo.md</w:t>
-      </w:r>
-      <w:r>
-        <w:t>).</w:t>
-      </w:r>
-    </w:p>
-    <w:p>
-      <w:r>
-        <w:t>Class imbalance was handled by class-weighting (</w:t>
-      </w:r>
-      <w:r>
-        <w:rPr>
-          <w:rFonts w:ascii="Courier New" w:hAnsi="Courier New"/>
-        </w:rPr>
-        <w:t>class_weight='balanced'</w:t>
-      </w:r>
-      <w:r>
-        <w:t xml:space="preserve"> for RF; per-fold </w:t>
-      </w:r>
-      <w:r>
-        <w:rPr>
-          <w:rFonts w:ascii="Courier New" w:hAnsi="Courier New"/>
-        </w:rPr>
-        <w:t>scale_pos_weight</w:t>
-      </w:r>
-      <w:r>
-        <w:t xml:space="preserve"> for XGBoost); SMOTE was not used.</w:t>
+        <w:t>results/combat_results.csv</w:t>
+      </w:r>
+      <w:r>
+        <w:t>): the ComBat-corrected pooled per-cohort mean AUC is 0.815 versus 0.807 uncorrected, and qualitative conclusions are unchanged. This ordering — design first, statistical correction second — reflects the view that residual batch structure that survives country-aware LODO is not reliably removed by mean/variance harmonisation alone.</w:t>
       </w:r>
     </w:p>
     <w:p>
@@ -565,30 +462,178 @@
         <w:pStyle w:val="Heading2"/>
       </w:pPr>
       <w:r>
-        <w:t>Statistical comparison of classifiers</w:t>
+        <w:t>Classifiers</w:t>
       </w:r>
     </w:p>
     <w:p>
       <w:r>
-        <w:t>Model performance was compared using three complementary tests. First, per-cohort AUC differences across the 10 LODO folds were assessed by paired t-test (df = 9) and Wilcoxon signed-rank test, with 95% bootstrap confidence intervals on the mean difference (</w:t>
+        <w:rPr>
+          <w:b/>
+        </w:rPr>
+        <w:t>CRC vs control.</w:t>
+      </w:r>
+      <w:r>
+        <w:t xml:space="preserve"> Binary classification of CRC (n = 674) versus controls (n = 665) was performed on the 1,339 case/control subjects under country-aware LODO. Three models were compared: (1) species-only Random Forest, (2) joint species-plus-pathway Random Forest, and (3) joint species-plus-pathway XGBoost. Random Forest was configured with </w:t>
       </w:r>
       <w:r>
         <w:rPr>
           <w:rFonts w:ascii="Courier New" w:hAnsi="Courier New"/>
         </w:rPr>
-        <w:t>scripts/auc_comparison.py</w:t>
-      </w:r>
-      <w:r>
-        <w:t>). These per-cohort tests have limited power at n = 10. Second, the DeLong test (DeLong et al. 1988) using the fast implementation of Sun and Xu (2014) was applied to pooled held-out predictions (n = 1,339), comparing the ROC curves of each classifier pair on the same sample-level predictions. The DeLong test has substantially greater statistical power than the per-cohort paired tests and is the inferential anchor of the manuscript. Per-sample LODO predictions (sample_id, cohort, y_true, y_prob) were saved in long format per classifier (</w:t>
+        <w:t>n_estimators = 500</w:t>
+      </w:r>
+      <w:r>
+        <w:t xml:space="preserve">, </w:t>
       </w:r>
       <w:r>
         <w:rPr>
           <w:rFonts w:ascii="Courier New" w:hAnsi="Courier New"/>
         </w:rPr>
-        <w:t>results/preds_*.csv</w:t>
-      </w:r>
-      <w:r>
-        <w:t>) to enable post-hoc DeLong comparisons without re-running classifiers.</w:t>
+        <w:t>max_features = 'sqrt'</w:t>
+      </w:r>
+      <w:r>
+        <w:t xml:space="preserve">, </w:t>
+      </w:r>
+      <w:r>
+        <w:rPr>
+          <w:rFonts w:ascii="Courier New" w:hAnsi="Courier New"/>
+        </w:rPr>
+        <w:t>min_samples_leaf = 5</w:t>
+      </w:r>
+      <w:r>
+        <w:t xml:space="preserve">, </w:t>
+      </w:r>
+      <w:r>
+        <w:rPr>
+          <w:rFonts w:ascii="Courier New" w:hAnsi="Courier New"/>
+        </w:rPr>
+        <w:t>class_weight = 'balanced'</w:t>
+      </w:r>
+      <w:r>
+        <w:t xml:space="preserve">. XGBoost was configured with </w:t>
+      </w:r>
+      <w:r>
+        <w:rPr>
+          <w:rFonts w:ascii="Courier New" w:hAnsi="Courier New"/>
+        </w:rPr>
+        <w:t>n_estimators = 500</w:t>
+      </w:r>
+      <w:r>
+        <w:t xml:space="preserve">, </w:t>
+      </w:r>
+      <w:r>
+        <w:rPr>
+          <w:rFonts w:ascii="Courier New" w:hAnsi="Courier New"/>
+        </w:rPr>
+        <w:t>max_depth = 6</w:t>
+      </w:r>
+      <w:r>
+        <w:t xml:space="preserve">, </w:t>
+      </w:r>
+      <w:r>
+        <w:rPr>
+          <w:rFonts w:ascii="Courier New" w:hAnsi="Courier New"/>
+        </w:rPr>
+        <w:t>learning_rate = 0.1</w:t>
+      </w:r>
+      <w:r>
+        <w:t xml:space="preserve">, </w:t>
+      </w:r>
+      <w:r>
+        <w:rPr>
+          <w:rFonts w:ascii="Courier New" w:hAnsi="Courier New"/>
+        </w:rPr>
+        <w:t>subsample = 0.8</w:t>
+      </w:r>
+      <w:r>
+        <w:t xml:space="preserve">, </w:t>
+      </w:r>
+      <w:r>
+        <w:rPr>
+          <w:rFonts w:ascii="Courier New" w:hAnsi="Courier New"/>
+        </w:rPr>
+        <w:t>colsample_bytree = 0.8</w:t>
+      </w:r>
+      <w:r>
+        <w:t xml:space="preserve">; for adenoma tasks, XGBoost additionally used </w:t>
+      </w:r>
+      <w:r>
+        <w:rPr>
+          <w:rFonts w:ascii="Courier New" w:hAnsi="Courier New"/>
+        </w:rPr>
+        <w:t>scale_pos_weight</w:t>
+      </w:r>
+      <w:r>
+        <w:t xml:space="preserve"> equal to the inverse class ratio recomputed per fold. Hyperparameters were not tuned via nested cross-validation because the joint model did not statistically outperform the species-only baseline, making further optimization unlikely to alter qualitative conclusions. All models used </w:t>
+      </w:r>
+      <w:r>
+        <w:rPr>
+          <w:rFonts w:ascii="Courier New" w:hAnsi="Courier New"/>
+        </w:rPr>
+        <w:t>random_state = 42</w:t>
+      </w:r>
+      <w:r>
+        <w:t xml:space="preserve"> unless stated otherwise.</w:t>
+      </w:r>
+    </w:p>
+    <w:p>
+      <w:r>
+        <w:rPr>
+          <w:b/>
+        </w:rPr>
+        <w:t>Adenoma classification.</w:t>
+      </w:r>
+      <w:r>
+        <w:t xml:space="preserve"> Four cohorts contain adenoma samples (FengQ_2015: n = 47; YachidaS_2019: n = 67; ZellerG_2014: n = 42; ThomasAM_2018a: n = 27; total n = 183). All four are from different countries, so no additional country-aware exclusion is required. Two binary tasks were evaluated under country-aware LODO across these four cohorts: control-vs-adenoma (H-vs-A) and adenoma-vs-CRC (A-vs-CRC), each with RF and XGBoost. An earlier within-cohort pooled five-fold protocol (</w:t>
+      </w:r>
+      <w:r>
+        <w:rPr>
+          <w:rFonts w:ascii="Courier New" w:hAnsi="Courier New"/>
+        </w:rPr>
+        <w:t>train_adenoma.py</w:t>
+      </w:r>
+      <w:r>
+        <w:t xml:space="preserve">) is retained in the repository for reference only; all current adenoma results use </w:t>
+      </w:r>
+      <w:r>
+        <w:rPr>
+          <w:rFonts w:ascii="Courier New" w:hAnsi="Courier New"/>
+        </w:rPr>
+        <w:t>adenoma_lodo.py</w:t>
+      </w:r>
+      <w:r>
+        <w:t xml:space="preserve"> (Decision Memo, </w:t>
+      </w:r>
+      <w:r>
+        <w:rPr>
+          <w:rFonts w:ascii="Courier New" w:hAnsi="Courier New"/>
+        </w:rPr>
+        <w:t>results/adenoma_go_nogo_memo.md</w:t>
+      </w:r>
+      <w:r>
+        <w:t>).</w:t>
+      </w:r>
+    </w:p>
+    <w:p>
+      <w:r>
+        <w:t>Class imbalance was handled by class-weighting (</w:t>
+      </w:r>
+      <w:r>
+        <w:rPr>
+          <w:rFonts w:ascii="Courier New" w:hAnsi="Courier New"/>
+        </w:rPr>
+        <w:t>class_weight='balanced'</w:t>
+      </w:r>
+      <w:r>
+        <w:t xml:space="preserve"> for RF; per-fold </w:t>
+      </w:r>
+      <w:r>
+        <w:rPr>
+          <w:rFonts w:ascii="Courier New" w:hAnsi="Courier New"/>
+        </w:rPr>
+        <w:t>scale_pos_weight</w:t>
+      </w:r>
+      <w:r>
+        <w:t xml:space="preserve"> for XGBoost); SMOTE was not used.</w:t>
       </w:r>
     </w:p>
     <w:p>
@@ -596,21 +641,30 @@
         <w:pStyle w:val="Heading2"/>
       </w:pPr>
       <w:r>
-        <w:t>Bootstrap confidence intervals</w:t>
+        <w:t>Statistical comparison of classifiers</w:t>
       </w:r>
     </w:p>
     <w:p>
       <w:r>
-        <w:t>Nonparametric bootstrap 95% confidence intervals were computed using 10,000 iterations (</w:t>
+        <w:t>Model performance was compared using three complementary tests. First, per-cohort AUC differences across the 10 LODO folds were assessed by paired t-test (df = 9) and Wilcoxon signed-rank test, with 95% bootstrap confidence intervals on the mean difference (</w:t>
       </w:r>
       <w:r>
         <w:rPr>
           <w:rFonts w:ascii="Courier New" w:hAnsi="Courier New"/>
         </w:rPr>
-        <w:t>scripts/bootstrap_ci.py</w:t>
-      </w:r>
-      <w:r>
-        <w:t>). Per-cohort CIs use i.i.d. resampling within each held-out cohort; pooled CIs use cohort-stratified resampling (resampling within each cohort separately and concatenating) to preserve the LODO sample-size structure.</w:t>
+        <w:t>scripts/auc_comparison.py</w:t>
+      </w:r>
+      <w:r>
+        <w:t>). These per-cohort tests have limited power at n = 10. Second, the DeLong test (DeLong et al. 1988) using the fast implementation of Sun and Xu (2014) was applied to pooled held-out predictions (n = 1,339), comparing the ROC curves of each classifier pair on the same sample-level predictions. The DeLong test has substantially greater statistical power than the per-cohort paired tests and is the inferential anchor of the manuscript. Per-sample LODO predictions (sample_id, cohort, y_true, y_prob) were saved in long format per classifier (</w:t>
+      </w:r>
+      <w:r>
+        <w:rPr>
+          <w:rFonts w:ascii="Courier New" w:hAnsi="Courier New"/>
+        </w:rPr>
+        <w:t>results/preds_*.csv</w:t>
+      </w:r>
+      <w:r>
+        <w:t>) to enable post-hoc DeLong comparisons without re-running classifiers.</w:t>
       </w:r>
     </w:p>
     <w:p>
@@ -618,21 +672,21 @@
         <w:pStyle w:val="Heading2"/>
       </w:pPr>
       <w:r>
-        <w:t>Feature importance</w:t>
+        <w:t>Bootstrap confidence intervals</w:t>
       </w:r>
     </w:p>
     <w:p>
       <w:r>
-        <w:t>Per-feature contributions were quantified using SHAP (SHapley Additive exPlanations; Lundberg and Lee 2017) values computed with TreeSHAP on the joint RF, joint XGBoost, and the two adenoma classifiers (</w:t>
+        <w:t>Nonparametric bootstrap 95% confidence intervals were computed using 10,000 iterations (</w:t>
       </w:r>
       <w:r>
         <w:rPr>
           <w:rFonts w:ascii="Courier New" w:hAnsi="Courier New"/>
         </w:rPr>
-        <w:t>results/shap_*.csv</w:t>
-      </w:r>
-      <w:r>
-        <w:t>). The top features by mean absolute SHAP value were compared across model architectures and across the H-vs-A, CRC-vs-control, and A-vs-CRC tasks.</w:t>
+        <w:t>scripts/bootstrap_ci.py</w:t>
+      </w:r>
+      <w:r>
+        <w:t>). Per-cohort CIs use i.i.d. resampling within each held-out cohort; pooled CIs use cohort-stratified resampling (resampling within each cohort separately and concatenating) to preserve the LODO sample-size structure.</w:t>
       </w:r>
     </w:p>
     <w:p>
@@ -640,6 +694,28 @@
         <w:pStyle w:val="Heading2"/>
       </w:pPr>
       <w:r>
+        <w:t>Feature importance</w:t>
+      </w:r>
+    </w:p>
+    <w:p>
+      <w:r>
+        <w:t>Per-feature contributions were quantified using SHAP (SHapley Additive exPlanations; Lundberg and Lee 2017) values computed with TreeSHAP on the joint RF, joint XGBoost, and the two adenoma classifiers (</w:t>
+      </w:r>
+      <w:r>
+        <w:rPr>
+          <w:rFonts w:ascii="Courier New" w:hAnsi="Courier New"/>
+        </w:rPr>
+        <w:t>results/shap_*.csv</w:t>
+      </w:r>
+      <w:r>
+        <w:t>). The top features by mean absolute SHAP value were compared across model architectures and across the H-vs-A, CRC-vs-control, and A-vs-CRC tasks.</w:t>
+      </w:r>
+    </w:p>
+    <w:p>
+      <w:pPr>
+        <w:pStyle w:val="Heading2"/>
+      </w:pPr>
+      <w:r>
         <w:t>Robustness battery</w:t>
       </w:r>
     </w:p>
@@ -699,10 +775,19 @@
         <w:rPr>
           <w:b/>
         </w:rPr>
-        <w:t>Batch correction.</w:t>
-      </w:r>
-      <w:r>
-        <w:t xml:space="preserve"> Per-fold ComBat (Johnson et al. 2007), as implemented in </w:t>
+        <w:t>Batch correction (robustness check).</w:t>
+      </w:r>
+      <w:r>
+        <w:t xml:space="preserve"> As described in </w:t>
+      </w:r>
+      <w:r>
+        <w:rPr>
+          <w:i/>
+        </w:rPr>
+        <w:t>Batch-effect mitigation</w:t>
+      </w:r>
+      <w:r>
+        <w:t xml:space="preserve"> above, per-fold ComBat (Johnson et al. 2007), as implemented in </w:t>
       </w:r>
       <w:r>
         <w:rPr>
@@ -711,7 +796,7 @@
         <w:t>combat.pycombat.pycombat</w:t>
       </w:r>
       <w:r>
-        <w:t>, was applied to species features within each LODO fold. ComBat was fit jointly on train and test feature matrices using only batch labels (</w:t>
+        <w:t>, was applied to species features within each LODO fold and reported as a robustness check on the country-aware LODO design rather than as the primary correction. ComBat was fit jointly on train and test feature matrices using only batch labels (</w:t>
       </w:r>
       <w:r>
         <w:rPr>
@@ -720,7 +805,16 @@
         <w:t>study_name</w:t>
       </w:r>
       <w:r>
-        <w:t>); class labels were never seen by ComBat, preserving LODO no-leakage while keeping train and test in the same corrected feature space.</w:t>
+        <w:t>); class labels were never seen by ComBat, preserving LODO no-leakage while keeping train and test in the same corrected feature space. Pooled per-cohort mean AUC: 0.815 corrected versus 0.807 uncorrected (</w:t>
+      </w:r>
+      <w:r>
+        <w:rPr>
+          <w:rFonts w:ascii="Courier New" w:hAnsi="Courier New"/>
+        </w:rPr>
+        <w:t>results/combat_results.csv</w:t>
+      </w:r>
+      <w:r>
+        <w:t>).</w:t>
       </w:r>
     </w:p>
     <w:p>
@@ -1384,17 +1478,12 @@
         <w:pStyle w:val="Heading2"/>
       </w:pPr>
       <w:r>
-        <w:t>Why pathways do not help, despite biological plausibility</w:t>
+        <w:t>Negative result on pathways is consistent with over-parameterization</w:t>
       </w:r>
     </w:p>
     <w:p>
       <w:r>
-        <w:t>Microbial metabolic pathways implicated in CRC — choline trimethylamine-lyase, secondary bile-acid biosynthesis, polyamine metabolism, hydrogen sulfide production, butyrate fermentation — are biologically well-motivated and have been highlighted by prior cross-cohort studies (Thomas et al. 2019; Wirbel et al. 2019). Why, then, do they not improve a joint classifier?</w:t>
-      </w:r>
-    </w:p>
-    <w:p>
-      <w:r>
-        <w:t xml:space="preserve">The simplest explanation is dimensionality. Joining 402–406 per-fold pathway features to the 229 species features nearly triples the feature count without a proportional gain in discriminative signal. Under Random Forest with </w:t>
+        <w:t>The joint species-plus-pathway model adds roughly 400 community-level pathway features to the 229 retained species without improving per-fold AUC and significantly degrades pooled discrimination relative to the species-only baseline (DeLong z = 3.35, p = 0.0008 for joint RF; z = 2.00, p = 0.046 for joint XGBoost; n = 1,339). This pattern is consistent with the curse of dimensionality acting on a fixed-n problem: nearly tripling the feature count without a proportional gain in independent signal dilutes the probability that the most informative taxa are sampled at each split (</w:t>
       </w:r>
       <w:r>
         <w:rPr>
@@ -1403,7 +1492,7 @@
         <w:t>max_features = 'sqrt'</w:t>
       </w:r>
       <w:r>
-        <w:t xml:space="preserve">, the probability that the most informative species are sampled at each split decreases as the candidate pool grows; under XGBoost with </w:t>
+        <w:t xml:space="preserve"> in Random Forest; </w:t>
       </w:r>
       <w:r>
         <w:rPr>
@@ -1412,12 +1501,7 @@
         <w:t>colsample_bytree = 0.8</w:t>
       </w:r>
       <w:r>
-        <w:t>, a similar dilution occurs. The DeLong signal is driven primarily by the largest fold (YachidaS_2019, n_test = 508), where the species-only model reaches AUC 0.708 versus 0.669 (joint RF) and 0.694 (joint XGBoost) — exactly the fold where stable feature ranking matters most.</w:t>
-      </w:r>
-    </w:p>
-    <w:p>
-      <w:r>
-        <w:t>A complementary explanation is redundancy. Functional pathway abundance is heavily correlated with the taxa that encode the corresponding genes; the four oral pathobionts that top the species SHAP rankings (</w:t>
+        <w:t xml:space="preserve"> in XGBoost). Pathway features are also highly correlated with the taxa that encode the corresponding genes — the four oral pathobionts that top the species SHAP rankings (</w:t>
       </w:r>
       <w:r>
         <w:rPr>
@@ -1453,7 +1537,7 @@
         <w:t>Gemella morbillorum</w:t>
       </w:r>
       <w:r>
-        <w:t xml:space="preserve">) contribute to a wide set of pathways at the unstratified level, so much of the pathway "signal" is already captured by the species. The biologically-guided 84-pathway shortlist (mean LODO AUC 0.817 across cohorts; </w:t>
+        <w:t xml:space="preserve">) collectively contribute to a wide swathe of unstratified pathways — so much of the apparent "functional" signal is already captured by the taxonomic features. The biologically-guided shortlist (~66 retained features per fold drawn from 8 CRC-relevant functional groups; mean LODO AUC 0.817; </w:t>
       </w:r>
       <w:r>
         <w:rPr>
@@ -1462,12 +1546,7 @@
         <w:t>results/bio_pathway_results.csv</w:t>
       </w:r>
       <w:r>
-        <w:t>) confirms this interpretation: hand-curated CRC-relevant pathways perform comparably to the species baseline rather than outperforming it.</w:t>
-      </w:r>
-    </w:p>
-    <w:p>
-      <w:r>
-        <w:t>This is consistent with the broader high-dimensional / low-sample-size literature (Bellman 1961; Trunk 1979): at n ≈ 1,300 across heterogeneous cohorts, parsimony wins. It also harmonises with the recent Piccinno et al. (2025) result of mean AUC ~0.85 across 18 cohorts and 3,741 metagenomes: with substantially more training data the noise contribution of additional features may diminish. Our finding should be read as a statement about the current sample-size regime, not as a categorical claim that functional features can never help.</w:t>
+        <w:t>) shows the same pattern: no rescue of the joint model. Strain- or gene-level features were not evaluated because curatedMetagenomicData does not distribute them at the depth required for a 10-cohort pooled analysis. This is consistent with the broader high-dimensional / low-sample-size literature (Bellman 1961; Trunk 1979): at n ≈ 1,300 across heterogeneous cohorts, parsimony wins. The result should be read as a statement about the current sample-size regime — and the granularity of features available from standard pipelines — rather than as a categorical claim that functional features can never help; with substantially larger pooled datasets (Piccinno et al. 2025), the noise contribution of additional features may diminish.</w:t>
       </w:r>
     </w:p>
     <w:p>
@@ -1475,75 +1554,57 @@
         <w:pStyle w:val="Heading2"/>
       </w:pPr>
       <w:r>
-        <w:t>Biology of the CRC-enriched oral-pathobiont signature</w:t>
+        <w:t>Granularity of functional features</w:t>
       </w:r>
     </w:p>
     <w:p>
       <w:r>
-        <w:t xml:space="preserve">The top SHAP features for the CRC-vs-control classifier are dominated by taxa more typical of the oral cavity than of the colon: </w:t>
+        <w:t xml:space="preserve">Overall HUMAnN unstratified pathway abundances sit at an intermediate granularity between species composition and gene-level functional content: each feature is a community-level relative abundance for one MetaCyc pathway, summed across all contributing taxa. Two refinements at finer granularities were tested. First, a </w:t>
       </w:r>
       <w:r>
         <w:rPr>
           <w:i/>
         </w:rPr>
-        <w:t>Fusobacterium nucleatum</w:t>
-      </w:r>
-      <w:r>
-        <w:t xml:space="preserve">, </w:t>
+        <w:t>biologically-guided pathway shortlist</w:t>
+      </w:r>
+      <w:r>
+        <w:t xml:space="preserve"> (</w:t>
+      </w:r>
+      <w:r>
+        <w:rPr>
+          <w:rFonts w:ascii="Courier New" w:hAnsi="Courier New"/>
+        </w:rPr>
+        <w:t>scripts/bio_pathway_shortlist.py</w:t>
+      </w:r>
+      <w:r>
+        <w:t xml:space="preserve">) restricted candidate pathways to eight CRC-relevant functional groups — butyrate / short-chain fatty acid production, fermentation, lipopolysaccharide and inflammation pathways, polyamine synthesis, tryptophan metabolism, folate and one-carbon metabolism, sulfur and methionine metabolism, and glycan / mucin degradation — selected from the published CRC microbiome literature before any model fitting. Second, </w:t>
       </w:r>
       <w:r>
         <w:rPr>
           <w:i/>
         </w:rPr>
-        <w:t>Peptostreptococcus stomatis</w:t>
+        <w:t>species-stratified pathways</w:t>
+      </w:r>
+      <w:r>
+        <w:t xml:space="preserve"> (</w:t>
+      </w:r>
+      <w:r>
+        <w:rPr>
+          <w:rFonts w:ascii="Courier New" w:hAnsi="Courier New"/>
+        </w:rPr>
+        <w:t>scripts/stratified_pathway_pilot.py</w:t>
       </w:r>
       <w:r>
         <w:t xml:space="preserve">, </w:t>
       </w:r>
       <w:r>
         <w:rPr>
-          <w:i/>
+          <w:rFonts w:ascii="Courier New" w:hAnsi="Courier New"/>
         </w:rPr>
-        <w:t>Parvimonas micra</w:t>
-      </w:r>
-      <w:r>
-        <w:t xml:space="preserve">, </w:t>
-      </w:r>
-      <w:r>
-        <w:rPr>
-          <w:i/>
-        </w:rPr>
-        <w:t>Gemella morbillorum</w:t>
-      </w:r>
-      <w:r>
-        <w:t xml:space="preserve">, </w:t>
-      </w:r>
-      <w:r>
-        <w:rPr>
-          <w:i/>
-        </w:rPr>
-        <w:t>Solobacterium moorei</w:t>
-      </w:r>
-      <w:r>
-        <w:t xml:space="preserve">, and </w:t>
-      </w:r>
-      <w:r>
-        <w:rPr>
-          <w:i/>
-        </w:rPr>
-        <w:t>Streptococcus salivarius</w:t>
-      </w:r>
-      <w:r>
-        <w:t xml:space="preserve">. </w:t>
-      </w:r>
-      <w:r>
-        <w:rPr>
-          <w:i/>
-        </w:rPr>
-        <w:t>F. nucleatum</w:t>
-      </w:r>
-      <w:r>
-        <w:t xml:space="preserve"> in particular has been mechanistically linked to CRC through FadA-mediated adhesion to E-cadherin, β-catenin signalling, and tumour-permissive immune modulation; the other taxa form part of a co-occurring oral consortium repeatedly observed in CRC tumours and stool. Their reproducibility across cohorts on three continents — at top SHAP ranks in both Random Forest and XGBoost despite very different splitting criteria — is the most convincing single observation in this analysis. It is also the feature signature that drives the moderate adenoma-vs-CRC performance, suggesting that oral-pathobiont colonisation is a relatively late event in the adenoma-carcinoma sequence.</w:t>
+        <w:t>results/stratified_pathway_pilot.csv</w:t>
+      </w:r>
+      <w:r>
+        <w:t>) decompose each pathway abundance into per-taxon contributions, producing &gt;4,000 columns at the cost of substantial sparsity and redundancy. Neither refinement rescued the joint model. We interpret this as evidence that, at the current dataset size, taxonomic composition already captures most of the discriminative signal accessible from shotgun metagenomics through standard MetaPhlAn / HUMAnN profiling. Genuinely additive functional information would, on this evidence, require strain- or gene-level resolution — and corresponding sample sizes — beyond the scope of this work.</w:t>
       </w:r>
     </w:p>
     <w:p>
@@ -1551,30 +1612,75 @@
         <w:pStyle w:val="Heading2"/>
       </w:pPr>
       <w:r>
-        <w:t>A stepwise model of microbiome change along the adenoma-carcinoma sequence</w:t>
+        <w:t>Biology of the CRC-enriched oral-pathobiont signature</w:t>
       </w:r>
     </w:p>
     <w:p>
       <w:r>
-        <w:t xml:space="preserve">The adenoma LODO results provide a coherent stage-specific picture. </w:t>
+        <w:t xml:space="preserve">The top SHAP features for the CRC-vs-control classifier are dominated by taxa more typical of the oral cavity than of the colon: </w:t>
       </w:r>
       <w:r>
         <w:rPr>
-          <w:b/>
+          <w:i/>
         </w:rPr>
-        <w:t>Control vs adenoma</w:t>
-      </w:r>
-      <w:r>
-        <w:t xml:space="preserve"> classification was near chance (RF 0.561, XGBoost 0.579), with TreeSHAP highlighting weak, heterogeneous metabolic and commensal-depletion features. </w:t>
+        <w:t>Fusobacterium nucleatum</w:t>
+      </w:r>
+      <w:r>
+        <w:t xml:space="preserve">, </w:t>
       </w:r>
       <w:r>
         <w:rPr>
-          <w:b/>
+          <w:i/>
         </w:rPr>
-        <w:t>Adenoma vs CRC</w:t>
-      </w:r>
-      <w:r>
-        <w:t xml:space="preserve"> classification was moderate (RF 0.671, XGBoost 0.617), with TreeSHAP dominated by the same oral-pathobiont signature that drives CRC-vs-control. This pattern is consistent with a model in which (i) the microbiome of early-stage adenoma is largely indistinguishable from healthy controls by global stool composition, and (ii) the oral-pathobiont enrichment is acquired at or near the transition to invasive carcinoma. Such a model has clinical implications: stool metagenomic screens are unlikely to detect early adenomas at useful sensitivity, but may have value in distinguishing advanced lesions from carcinoma and in monitoring post-resection recurrence. It also reinforces that adenoma and CRC are biologically distinct microbiome states rather than two points on a smooth severity gradient.</w:t>
+        <w:t>Peptostreptococcus stomatis</w:t>
+      </w:r>
+      <w:r>
+        <w:t xml:space="preserve">, </w:t>
+      </w:r>
+      <w:r>
+        <w:rPr>
+          <w:i/>
+        </w:rPr>
+        <w:t>Parvimonas micra</w:t>
+      </w:r>
+      <w:r>
+        <w:t xml:space="preserve">, </w:t>
+      </w:r>
+      <w:r>
+        <w:rPr>
+          <w:i/>
+        </w:rPr>
+        <w:t>Gemella morbillorum</w:t>
+      </w:r>
+      <w:r>
+        <w:t xml:space="preserve">, </w:t>
+      </w:r>
+      <w:r>
+        <w:rPr>
+          <w:i/>
+        </w:rPr>
+        <w:t>Solobacterium moorei</w:t>
+      </w:r>
+      <w:r>
+        <w:t xml:space="preserve">, and </w:t>
+      </w:r>
+      <w:r>
+        <w:rPr>
+          <w:i/>
+        </w:rPr>
+        <w:t>Streptococcus salivarius</w:t>
+      </w:r>
+      <w:r>
+        <w:t xml:space="preserve">. </w:t>
+      </w:r>
+      <w:r>
+        <w:rPr>
+          <w:i/>
+        </w:rPr>
+        <w:t>F. nucleatum</w:t>
+      </w:r>
+      <w:r>
+        <w:t xml:space="preserve"> in particular has been mechanistically linked to CRC through FadA-mediated adhesion to E-cadherin, β-catenin signalling, and tumour-permissive immune modulation; the other taxa form part of a co-occurring oral consortium repeatedly observed in CRC tumours and stool. Their reproducibility across cohorts on three continents — at top SHAP ranks in both Random Forest and XGBoost despite very different splitting criteria — is the most convincing single observation in this analysis. It is also the feature signature that drives the moderate adenoma-vs-CRC performance, suggesting that oral-pathobiont colonisation is a relatively late event in the adenoma-carcinoma sequence.</w:t>
       </w:r>
     </w:p>
     <w:p>
@@ -1582,12 +1688,83 @@
         <w:pStyle w:val="Heading2"/>
       </w:pPr>
       <w:r>
-        <w:t>Cross-cohort generalisation</w:t>
+        <w:t>A stepwise model of microbiome change along the adenoma-carcinoma sequence</w:t>
       </w:r>
     </w:p>
     <w:p>
       <w:r>
-        <w:t>The country-aware LODO design provides what we view as a credible test of cross-cohort generalisation. The species-only RF reached per-cohort AUC ≥ 0.69 in every fold and ≥ 0.80 in 7 of 10 folds, despite training cohorts being excluded whenever they shared country with the test cohort. The two Italian cohorts and the two Japanese cohorts were thus never used to train models tested on their country-mates, removing a confound that would otherwise have inflated ThomasAM_2019_c to AUC ≈ 0.999. The classifier's robustness to ComBat batch correction (within 0.008 of the uncorrected baseline; corrected 0.815 vs uncorrected 0.807) further suggests that the biological signal substantially exceeds residual technical batch effects under this design.</w:t>
+        <w:t xml:space="preserve">The adenoma LODO results provide a coherent stage-specific picture. </w:t>
+      </w:r>
+      <w:r>
+        <w:rPr>
+          <w:b/>
+        </w:rPr>
+        <w:t>Control vs adenoma</w:t>
+      </w:r>
+      <w:r>
+        <w:t xml:space="preserve"> classification was near chance (RF 0.561, XGBoost 0.579), with TreeSHAP highlighting weak, heterogeneous metabolic and commensal-depletion features. </w:t>
+      </w:r>
+      <w:r>
+        <w:rPr>
+          <w:b/>
+        </w:rPr>
+        <w:t>Adenoma vs CRC</w:t>
+      </w:r>
+      <w:r>
+        <w:t xml:space="preserve"> classification was moderate (RF 0.671, XGBoost 0.617), with TreeSHAP dominated by the same oral-pathobiont signature that drives CRC-vs-control. This pattern is consistent with a model in which (i) the microbiome of early-stage adenoma is largely indistinguishable from healthy controls by global stool composition, and (ii) the oral-pathobiont enrichment is acquired at or near the transition to invasive carcinoma. Such a model has clinical implications: stool metagenomic screens are unlikely to detect early adenomas at useful sensitivity, but may have value in distinguishing advanced lesions from carcinoma and in monitoring post-resection recurrence. It also reinforces that adenoma and CRC are biologically distinct microbiome states rather than two points on a smooth severity gradient.</w:t>
+      </w:r>
+    </w:p>
+    <w:p>
+      <w:pPr>
+        <w:pStyle w:val="Heading2"/>
+      </w:pPr>
+      <w:r>
+        <w:t>Adenoma analysis: class-balance robustness</w:t>
+      </w:r>
+    </w:p>
+    <w:p>
+      <w:r>
+        <w:t>The adenoma LODO folds have small minority-class counts per cohort (n_adenoma ranges from 27 in ThomasAM_2018a to 67 in YachidaS_2019), which raises the possibility that the near-chance control-vs-adenoma result is a methodological artefact of class imbalance rather than a biological observation. We tested this directly with three per-fold class-rebalancing strategies, applied to the training fold only (</w:t>
+      </w:r>
+      <w:r>
+        <w:rPr>
+          <w:rFonts w:ascii="Courier New" w:hAnsi="Courier New"/>
+        </w:rPr>
+        <w:t>scripts/rebalanced_adenoma_lodo.py</w:t>
+      </w:r>
+      <w:r>
+        <w:t xml:space="preserve">): inverse-frequency reweighting, random undersampling of the majority class, and SMOTE oversampling of the minority class. The comparison is summarised in </w:t>
+      </w:r>
+      <w:r>
+        <w:rPr>
+          <w:rFonts w:ascii="Courier New" w:hAnsi="Courier New"/>
+        </w:rPr>
+        <w:t>results/adenoma_rebalanced_summary.csv</w:t>
+      </w:r>
+      <w:r>
+        <w:t>. The qualitative finding — healthy-vs-adenoma near chance and adenoma-vs-CRC moderate — was robust across all three rebalancing strategies and consistent with the headline class-weighted run. We therefore interpret the weak adenoma signal as reflecting true biological under-determination of pre-cancerous microbiome change at the granularity of standard shotgun metagenomic profiling, rather than a sampling-imbalance artefact.</w:t>
+      </w:r>
+    </w:p>
+    <w:p>
+      <w:pPr>
+        <w:pStyle w:val="Heading2"/>
+      </w:pPr>
+      <w:r>
+        <w:t>Batch effects vs cross-cohort generalisation</w:t>
+      </w:r>
+    </w:p>
+    <w:p>
+      <w:r>
+        <w:t xml:space="preserve">Cross-cohort variability in DNA extraction, library preparation, sequencing depth, and host population genetics is the dominant source of microbiome variation across these 10 cohorts, and any cross-cohort classification result must be read against that background. Two design choices respond directly to this. First, country-aware LODO treats each cohort as a single batch and additionally excludes same-country cohorts from training, removing geographic and population-level confounding that would otherwise leak through diet- and host-genetics-correlated taxa: the most explicit illustration is the ThomasAM_2019_c fold, where allowing YachidaS_2019 (the second Japanese cohort) into training inflated test AUC to 0.998, dropping to 0.836 once Japan is excluded. The species-only RF reached per-cohort AUC ≥ 0.69 in every fold and ≥ 0.80 in 7 of 10 folds under this stricter split. Second, per-fold filtering and feature normalisation use training-cohort statistics only, preventing test-cohort sample composition from influencing the feature set or its scaling. ComBat applied per fold as a robustness check increases pooled per-cohort mean AUC marginally (0.815 vs 0.807 uncorrected; </w:t>
+      </w:r>
+      <w:r>
+        <w:rPr>
+          <w:rFonts w:ascii="Courier New" w:hAnsi="Courier New"/>
+        </w:rPr>
+        <w:t>results/combat_results.csv</w:t>
+      </w:r>
+      <w:r>
+        <w:t>) and does not change the qualitative conclusions, which we interpret as evidence that the biological signal survives the dominant technical batch effects under the country-aware LODO design rather than being recovered by post-hoc mean/variance harmonisation.</w:t>
       </w:r>
     </w:p>
     <w:p>
@@ -1636,32 +1813,6 @@
       </w:pPr>
       <w:r>
         <w:t>References</w:t>
-      </w:r>
-    </w:p>
-    <w:p>
-      <w:pPr>
-        <w:pStyle w:val="ListNumber"/>
-      </w:pPr>
-      <w:r>
-        <w:t xml:space="preserve">Austin, G.I., Brown Kav, A., ElNaggar, S. et al. Processing-bias correction with DEBIAS-M improves cross-study generalization of microbiome-based prediction models. </w:t>
-      </w:r>
-      <w:r>
-        <w:rPr>
-          <w:i/>
-        </w:rPr>
-        <w:t>Nat. Microbiol.</w:t>
-      </w:r>
-      <w:r>
-        <w:t xml:space="preserve"> </w:t>
-      </w:r>
-      <w:r>
-        <w:rPr>
-          <w:b/>
-        </w:rPr>
-        <w:t>10</w:t>
-      </w:r>
-      <w:r>
-        <w:t>, 897–911 (2025). https://doi.org/10.1038/s41564-025-01954-4</w:t>
       </w:r>
     </w:p>
     <w:p>

</xml_diff>